<commit_message>
new notes about dbt
</commit_message>
<xml_diff>
--- a/dbt/dbt notes.docx
+++ b/dbt/dbt notes.docx
@@ -80,7 +80,37 @@
         <w:spacing w:after="0"/>
       </w:pPr>
       <w:r>
-        <w:t>What we need to do is:</w:t>
+        <w:t>What we need to do is</w:t>
+      </w:r>
+      <w:r>
+        <w:t xml:space="preserve"> </w:t>
+      </w:r>
+      <w:r>
+        <w:t xml:space="preserve">(we need </w:t>
+      </w:r>
+      <w:r>
+        <w:t>to execute a</w:t>
+      </w:r>
+      <w:r>
+        <w:t>ll the below comm</w:t>
+      </w:r>
+      <w:r>
+        <w:t>a</w:t>
+      </w:r>
+      <w:r>
+        <w:t>nd</w:t>
+      </w:r>
+      <w:r>
+        <w:t>s</w:t>
+      </w:r>
+      <w:r>
+        <w:t xml:space="preserve"> in the directory with the dbt project</w:t>
+      </w:r>
+      <w:r>
+        <w:t>)</w:t>
+      </w:r>
+      <w:r>
+        <w:t>:</w:t>
       </w:r>
     </w:p>
     <w:p>
@@ -106,7 +136,26 @@
         <w:spacing w:after="0"/>
       </w:pPr>
       <w:r>
-        <w:t xml:space="preserve">install python libraries: pip install </w:t>
+        <w:t>install python libraries</w:t>
+      </w:r>
+      <w:r>
+        <w:t xml:space="preserve"> in that venv</w:t>
+      </w:r>
+      <w:r>
+        <w:t xml:space="preserve">: </w:t>
+      </w:r>
+    </w:p>
+    <w:p>
+      <w:pPr>
+        <w:pStyle w:val="ListParagraph"/>
+        <w:numPr>
+          <w:ilvl w:val="1"/>
+          <w:numId w:val="6"/>
+        </w:numPr>
+        <w:spacing w:after="0"/>
+      </w:pPr>
+      <w:r>
+        <w:t xml:space="preserve">pip install </w:t>
       </w:r>
       <w:r>
         <w:t>dbt-core</w:t>
@@ -114,27 +163,18 @@
     </w:p>
     <w:p>
       <w:pPr>
-        <w:spacing w:after="0"/>
-      </w:pPr>
-    </w:p>
-    <w:p>
-      <w:pPr>
-        <w:spacing w:after="0"/>
-      </w:pPr>
-      <w:r>
-        <w:t>All the below comm</w:t>
-      </w:r>
-      <w:r>
-        <w:t>a</w:t>
-      </w:r>
-      <w:r>
-        <w:t>nd</w:t>
-      </w:r>
-      <w:r>
-        <w:t>s</w:t>
-      </w:r>
-      <w:r>
-        <w:t xml:space="preserve"> execute in the directory with the dbt project.</w:t>
+        <w:pStyle w:val="ListParagraph"/>
+        <w:numPr>
+          <w:ilvl w:val="1"/>
+          <w:numId w:val="6"/>
+        </w:numPr>
+        <w:spacing w:after="0"/>
+      </w:pPr>
+      <w:r>
+        <w:t>pip install dbt-sqlserver</w:t>
+      </w:r>
+      <w:r>
+        <w:t xml:space="preserve"> (here we need to chose a porper adapter depending on what database we are using)</w:t>
       </w:r>
     </w:p>
     <w:p>
@@ -147,7 +187,7 @@
         <w:spacing w:after="0"/>
       </w:pPr>
       <w:r>
-        <w:t>Install dbt-sqlserver package: pip install dbt-sqlserver</w:t>
+        <w:t>create .dbt folder in the user directory, for example in the C:\Users\&lt;username&gt;: mkdir $home/.dbt</w:t>
       </w:r>
     </w:p>
     <w:p>
@@ -160,19 +200,6 @@
         <w:spacing w:after="0"/>
       </w:pPr>
       <w:r>
-        <w:t>create .dbt folder in the user directory, for example in the C:\Users\&lt;username&gt;: mkdir $home/.dbt</w:t>
-      </w:r>
-    </w:p>
-    <w:p>
-      <w:pPr>
-        <w:pStyle w:val="ListParagraph"/>
-        <w:numPr>
-          <w:ilvl w:val="0"/>
-          <w:numId w:val="9"/>
-        </w:numPr>
-        <w:spacing w:after="0"/>
-      </w:pPr>
-      <w:r>
         <w:t>Initialize dbt using the 'dbt init' command and provide the following values when prompted:</w:t>
       </w:r>
     </w:p>
@@ -259,6 +286,9 @@
         <w:spacing w:after="0"/>
       </w:pPr>
       <w:r>
+        <w:rPr>
+          <w:noProof/>
+        </w:rPr>
         <w:lastRenderedPageBreak/>
         <w:drawing>
           <wp:inline distT="0" distB="0" distL="0" distR="0" wp14:anchorId="3A866E46" wp14:editId="1F0667CC">
@@ -362,10 +392,7 @@
         <w:spacing w:after="0"/>
       </w:pPr>
       <w:r>
-        <w:t xml:space="preserve">Snapshots - </w:t>
-      </w:r>
-      <w:r>
-        <w:t>for creating slowly changing dimensions type 2.</w:t>
+        <w:t>Snapshots - for creating slowly changing dimensions type 2.</w:t>
       </w:r>
     </w:p>
     <w:p>
@@ -378,13 +405,7 @@
         <w:spacing w:after="0"/>
       </w:pPr>
       <w:r>
-        <w:t xml:space="preserve">Macros - </w:t>
-      </w:r>
-      <w:r>
-        <w:t>functions which we can use in other nodes</w:t>
-      </w:r>
-      <w:r>
-        <w:t>.</w:t>
+        <w:t>Macros - functions which we can use in other nodes.</w:t>
       </w:r>
     </w:p>
     <w:p>
@@ -491,6 +512,9 @@
         <w:spacing w:after="0"/>
       </w:pPr>
       <w:r>
+        <w:rPr>
+          <w:noProof/>
+        </w:rPr>
         <w:drawing>
           <wp:inline distT="0" distB="0" distL="0" distR="0" wp14:anchorId="074D2279" wp14:editId="15898BF9">
             <wp:extent cx="1131108" cy="2050910"/>
@@ -592,10 +616,7 @@
         <w:t>we will be saving created models.</w:t>
       </w:r>
       <w:r>
-        <w:t xml:space="preserve"> </w:t>
-      </w:r>
-      <w:r>
-        <w:t>It is created automatically when creating a dbt project.</w:t>
+        <w:t xml:space="preserve"> It is created automatically when creating a dbt project.</w:t>
       </w:r>
     </w:p>
     <w:p>
@@ -628,8 +649,64 @@
     </w:p>
     <w:p>
       <w:pPr>
-        <w:spacing w:after="0"/>
-      </w:pPr>
+        <w:pStyle w:val="Heading2"/>
+      </w:pPr>
+      <w:r>
+        <w:t>Targets</w:t>
+      </w:r>
+    </w:p>
+    <w:p>
+      <w:r>
+        <w:t>In the profiles.yml file we can specify different targets, that is different databases where we will be building models.</w:t>
+      </w:r>
+    </w:p>
+    <w:p>
+      <w:r>
+        <w:t>When we are building models using dbt commands we can specify in which target we want build our models:</w:t>
+      </w:r>
+    </w:p>
+    <w:p>
+      <w:r>
+        <w:rPr>
+          <w:noProof/>
+        </w:rPr>
+        <w:lastRenderedPageBreak/>
+        <w:drawing>
+          <wp:inline distT="0" distB="0" distL="0" distR="0" wp14:anchorId="59B9BC13" wp14:editId="1BAA2808">
+            <wp:extent cx="2448267" cy="885949"/>
+            <wp:effectExtent l="0" t="0" r="0" b="9525"/>
+            <wp:docPr id="1761989983" name="Picture 1" descr="A screen shot of a computer&#10;&#10;AI-generated content may be incorrect."/>
+            <wp:cNvGraphicFramePr>
+              <a:graphicFrameLocks xmlns:a="http://schemas.openxmlformats.org/drawingml/2006/main" noChangeAspect="1"/>
+            </wp:cNvGraphicFramePr>
+            <a:graphic xmlns:a="http://schemas.openxmlformats.org/drawingml/2006/main">
+              <a:graphicData uri="http://schemas.openxmlformats.org/drawingml/2006/picture">
+                <pic:pic xmlns:pic="http://schemas.openxmlformats.org/drawingml/2006/picture">
+                  <pic:nvPicPr>
+                    <pic:cNvPr id="1761989983" name="Picture 1" descr="A screen shot of a computer&#10;&#10;AI-generated content may be incorrect."/>
+                    <pic:cNvPicPr/>
+                  </pic:nvPicPr>
+                  <pic:blipFill>
+                    <a:blip r:embed="rId8"/>
+                    <a:stretch>
+                      <a:fillRect/>
+                    </a:stretch>
+                  </pic:blipFill>
+                  <pic:spPr>
+                    <a:xfrm>
+                      <a:off x="0" y="0"/>
+                      <a:ext cx="2448267" cy="885949"/>
+                    </a:xfrm>
+                    <a:prstGeom prst="rect">
+                      <a:avLst/>
+                    </a:prstGeom>
+                  </pic:spPr>
+                </pic:pic>
+              </a:graphicData>
+            </a:graphic>
+          </wp:inline>
+        </w:drawing>
+      </w:r>
     </w:p>
     <w:p>
       <w:pPr>
@@ -656,7 +733,7 @@
       <w:r>
         <w:t xml:space="preserve">. More info about that: </w:t>
       </w:r>
-      <w:hyperlink r:id="rId8" w:history="1">
+      <w:hyperlink r:id="rId9" w:history="1">
         <w:r>
           <w:rPr>
             <w:rStyle w:val="Hyperlink"/>
@@ -705,7 +782,6 @@
         <w:spacing w:after="0"/>
       </w:pPr>
       <w:r>
-        <w:lastRenderedPageBreak/>
         <w:t>And this will build a specific model:</w:t>
       </w:r>
     </w:p>
@@ -714,10 +790,7 @@
         <w:spacing w:after="0"/>
       </w:pPr>
       <w:r>
-        <w:t>Dbt run –select “model:model_name”</w:t>
-      </w:r>
-      <w:r>
-        <w:t>.</w:t>
+        <w:t>Dbt run –select “model:model_name”.</w:t>
       </w:r>
     </w:p>
     <w:p>
@@ -777,6 +850,45 @@
       <w:r>
         <w:t>Cosmos is a tool for running dbt nodes in Airflow.</w:t>
       </w:r>
+      <w:r>
+        <w:t xml:space="preserve"> Here are links to the documentation:</w:t>
+      </w:r>
+    </w:p>
+    <w:p>
+      <w:pPr>
+        <w:pStyle w:val="ListParagraph"/>
+        <w:numPr>
+          <w:ilvl w:val="0"/>
+          <w:numId w:val="12"/>
+        </w:numPr>
+        <w:spacing w:after="0"/>
+      </w:pPr>
+      <w:hyperlink r:id="rId10" w:history="1">
+        <w:r>
+          <w:rPr>
+            <w:rStyle w:val="Hyperlink"/>
+          </w:rPr>
+          <w:t>www.astronomer.io</w:t>
+        </w:r>
+      </w:hyperlink>
+    </w:p>
+    <w:p>
+      <w:pPr>
+        <w:pStyle w:val="ListParagraph"/>
+        <w:numPr>
+          <w:ilvl w:val="0"/>
+          <w:numId w:val="12"/>
+        </w:numPr>
+        <w:spacing w:after="0"/>
+      </w:pPr>
+      <w:hyperlink r:id="rId11" w:history="1">
+        <w:r>
+          <w:rPr>
+            <w:rStyle w:val="Hyperlink"/>
+          </w:rPr>
+          <w:t>astronomer.github.io</w:t>
+        </w:r>
+      </w:hyperlink>
     </w:p>
     <w:p>
       <w:pPr>
@@ -816,9 +928,281 @@
     <w:p>
       <w:pPr>
         <w:pStyle w:val="Heading2"/>
-        <w:spacing w:before="0" w:after="0"/>
-      </w:pPr>
-      <w:r>
+      </w:pPr>
+      <w:r>
+        <w:t>ProfileConfig</w:t>
+      </w:r>
+    </w:p>
+    <w:p>
+      <w:r>
+        <w:t>We need to create the ProfileConfig object where we provide path to the profiles.yml file and specifying the target:</w:t>
+      </w:r>
+    </w:p>
+    <w:p>
+      <w:r>
+        <w:drawing>
+          <wp:inline distT="0" distB="0" distL="0" distR="0" wp14:anchorId="7BD8EDD6" wp14:editId="1B96CE6B">
+            <wp:extent cx="5943600" cy="668020"/>
+            <wp:effectExtent l="0" t="0" r="0" b="0"/>
+            <wp:docPr id="2096329544" name="Picture 1"/>
+            <wp:cNvGraphicFramePr>
+              <a:graphicFrameLocks xmlns:a="http://schemas.openxmlformats.org/drawingml/2006/main" noChangeAspect="1"/>
+            </wp:cNvGraphicFramePr>
+            <a:graphic xmlns:a="http://schemas.openxmlformats.org/drawingml/2006/main">
+              <a:graphicData uri="http://schemas.openxmlformats.org/drawingml/2006/picture">
+                <pic:pic xmlns:pic="http://schemas.openxmlformats.org/drawingml/2006/picture">
+                  <pic:nvPicPr>
+                    <pic:cNvPr id="2096329544" name=""/>
+                    <pic:cNvPicPr/>
+                  </pic:nvPicPr>
+                  <pic:blipFill>
+                    <a:blip r:embed="rId12"/>
+                    <a:stretch>
+                      <a:fillRect/>
+                    </a:stretch>
+                  </pic:blipFill>
+                  <pic:spPr>
+                    <a:xfrm>
+                      <a:off x="0" y="0"/>
+                      <a:ext cx="5943600" cy="668020"/>
+                    </a:xfrm>
+                    <a:prstGeom prst="rect">
+                      <a:avLst/>
+                    </a:prstGeom>
+                  </pic:spPr>
+                </pic:pic>
+              </a:graphicData>
+            </a:graphic>
+          </wp:inline>
+        </w:drawing>
+      </w:r>
+    </w:p>
+    <w:p>
+      <w:pPr>
+        <w:spacing w:after="0"/>
+      </w:pPr>
+      <w:r>
+        <w:t>Then we are using this profile config object in the dbtTaskGroup or dbtDag functions:</w:t>
+      </w:r>
+    </w:p>
+    <w:p>
+      <w:pPr>
+        <w:spacing w:after="0"/>
+      </w:pPr>
+      <w:r>
+        <w:lastRenderedPageBreak/>
+        <w:drawing>
+          <wp:inline distT="0" distB="0" distL="0" distR="0" wp14:anchorId="4C581211" wp14:editId="1B201350">
+            <wp:extent cx="2514951" cy="600159"/>
+            <wp:effectExtent l="0" t="0" r="0" b="9525"/>
+            <wp:docPr id="1498785214" name="Picture 1" descr="A black screen with white text&#10;&#10;AI-generated content may be incorrect."/>
+            <wp:cNvGraphicFramePr>
+              <a:graphicFrameLocks xmlns:a="http://schemas.openxmlformats.org/drawingml/2006/main" noChangeAspect="1"/>
+            </wp:cNvGraphicFramePr>
+            <a:graphic xmlns:a="http://schemas.openxmlformats.org/drawingml/2006/main">
+              <a:graphicData uri="http://schemas.openxmlformats.org/drawingml/2006/picture">
+                <pic:pic xmlns:pic="http://schemas.openxmlformats.org/drawingml/2006/picture">
+                  <pic:nvPicPr>
+                    <pic:cNvPr id="1498785214" name="Picture 1" descr="A black screen with white text&#10;&#10;AI-generated content may be incorrect."/>
+                    <pic:cNvPicPr/>
+                  </pic:nvPicPr>
+                  <pic:blipFill>
+                    <a:blip r:embed="rId13"/>
+                    <a:stretch>
+                      <a:fillRect/>
+                    </a:stretch>
+                  </pic:blipFill>
+                  <pic:spPr>
+                    <a:xfrm>
+                      <a:off x="0" y="0"/>
+                      <a:ext cx="2514951" cy="600159"/>
+                    </a:xfrm>
+                    <a:prstGeom prst="rect">
+                      <a:avLst/>
+                    </a:prstGeom>
+                  </pic:spPr>
+                </pic:pic>
+              </a:graphicData>
+            </a:graphic>
+          </wp:inline>
+        </w:drawing>
+      </w:r>
+    </w:p>
+    <w:p>
+      <w:pPr>
+        <w:spacing w:after="0"/>
+      </w:pPr>
+    </w:p>
+    <w:p>
+      <w:pPr>
+        <w:pStyle w:val="Heading2"/>
+      </w:pPr>
+      <w:r>
+        <w:t>ProjectConfig</w:t>
+      </w:r>
+    </w:p>
+    <w:p>
+      <w:r>
+        <w:t>We need to create the ProjectConfig object where we provide a path to the dbt project and pass it to the dbtTaskGroup or dbtDag functions:</w:t>
+      </w:r>
+    </w:p>
+    <w:p>
+      <w:r>
+        <w:drawing>
+          <wp:inline distT="0" distB="0" distL="0" distR="0" wp14:anchorId="689060A7" wp14:editId="6A5D8A5E">
+            <wp:extent cx="5210902" cy="838317"/>
+            <wp:effectExtent l="0" t="0" r="8890" b="0"/>
+            <wp:docPr id="12391335" name="Picture 1" descr="A screen shot of a computer&#10;&#10;AI-generated content may be incorrect."/>
+            <wp:cNvGraphicFramePr>
+              <a:graphicFrameLocks xmlns:a="http://schemas.openxmlformats.org/drawingml/2006/main" noChangeAspect="1"/>
+            </wp:cNvGraphicFramePr>
+            <a:graphic xmlns:a="http://schemas.openxmlformats.org/drawingml/2006/main">
+              <a:graphicData uri="http://schemas.openxmlformats.org/drawingml/2006/picture">
+                <pic:pic xmlns:pic="http://schemas.openxmlformats.org/drawingml/2006/picture">
+                  <pic:nvPicPr>
+                    <pic:cNvPr id="12391335" name="Picture 1" descr="A screen shot of a computer&#10;&#10;AI-generated content may be incorrect."/>
+                    <pic:cNvPicPr/>
+                  </pic:nvPicPr>
+                  <pic:blipFill>
+                    <a:blip r:embed="rId14"/>
+                    <a:stretch>
+                      <a:fillRect/>
+                    </a:stretch>
+                  </pic:blipFill>
+                  <pic:spPr>
+                    <a:xfrm>
+                      <a:off x="0" y="0"/>
+                      <a:ext cx="5210902" cy="838317"/>
+                    </a:xfrm>
+                    <a:prstGeom prst="rect">
+                      <a:avLst/>
+                    </a:prstGeom>
+                  </pic:spPr>
+                </pic:pic>
+              </a:graphicData>
+            </a:graphic>
+          </wp:inline>
+        </w:drawing>
+      </w:r>
+    </w:p>
+    <w:p/>
+    <w:p>
+      <w:pPr>
+        <w:pStyle w:val="Heading2"/>
+      </w:pPr>
+      <w:r>
+        <w:t>ExecutionConfig</w:t>
+      </w:r>
+    </w:p>
+    <w:p>
+      <w:r>
+        <w:t xml:space="preserve">We need to create the ExecutionConfig object where we provide a path to the dbt executable. </w:t>
+      </w:r>
+    </w:p>
+    <w:p>
+      <w:r>
+        <w:t>It is a good practice to create a virtual environment for dbt, install there all the dbt libraries needed (dbt-core, dbt-databricks) and provide the following executable path:</w:t>
+      </w:r>
+    </w:p>
+    <w:p>
+      <w:r>
+        <w:drawing>
+          <wp:inline distT="0" distB="0" distL="0" distR="0" wp14:anchorId="545EBF5B" wp14:editId="3223CB21">
+            <wp:extent cx="5258534" cy="809738"/>
+            <wp:effectExtent l="0" t="0" r="0" b="9525"/>
+            <wp:docPr id="603315514" name="Picture 1" descr="A black screen with white text&#10;&#10;AI-generated content may be incorrect."/>
+            <wp:cNvGraphicFramePr>
+              <a:graphicFrameLocks xmlns:a="http://schemas.openxmlformats.org/drawingml/2006/main" noChangeAspect="1"/>
+            </wp:cNvGraphicFramePr>
+            <a:graphic xmlns:a="http://schemas.openxmlformats.org/drawingml/2006/main">
+              <a:graphicData uri="http://schemas.openxmlformats.org/drawingml/2006/picture">
+                <pic:pic xmlns:pic="http://schemas.openxmlformats.org/drawingml/2006/picture">
+                  <pic:nvPicPr>
+                    <pic:cNvPr id="603315514" name="Picture 1" descr="A black screen with white text&#10;&#10;AI-generated content may be incorrect."/>
+                    <pic:cNvPicPr/>
+                  </pic:nvPicPr>
+                  <pic:blipFill>
+                    <a:blip r:embed="rId15"/>
+                    <a:stretch>
+                      <a:fillRect/>
+                    </a:stretch>
+                  </pic:blipFill>
+                  <pic:spPr>
+                    <a:xfrm>
+                      <a:off x="0" y="0"/>
+                      <a:ext cx="5258534" cy="809738"/>
+                    </a:xfrm>
+                    <a:prstGeom prst="rect">
+                      <a:avLst/>
+                    </a:prstGeom>
+                  </pic:spPr>
+                </pic:pic>
+              </a:graphicData>
+            </a:graphic>
+          </wp:inline>
+        </w:drawing>
+      </w:r>
+    </w:p>
+    <w:p>
+      <w:r>
+        <w:t>And pass it to the dbtTaskGroup or dbtDag:</w:t>
+      </w:r>
+    </w:p>
+    <w:p>
+      <w:r>
+        <w:drawing>
+          <wp:inline distT="0" distB="0" distL="0" distR="0" wp14:anchorId="02A722F3" wp14:editId="1B21F5A1">
+            <wp:extent cx="2829320" cy="638264"/>
+            <wp:effectExtent l="0" t="0" r="9525" b="9525"/>
+            <wp:docPr id="998577790" name="Picture 1" descr="A black background with white text&#10;&#10;AI-generated content may be incorrect."/>
+            <wp:cNvGraphicFramePr>
+              <a:graphicFrameLocks xmlns:a="http://schemas.openxmlformats.org/drawingml/2006/main" noChangeAspect="1"/>
+            </wp:cNvGraphicFramePr>
+            <a:graphic xmlns:a="http://schemas.openxmlformats.org/drawingml/2006/main">
+              <a:graphicData uri="http://schemas.openxmlformats.org/drawingml/2006/picture">
+                <pic:pic xmlns:pic="http://schemas.openxmlformats.org/drawingml/2006/picture">
+                  <pic:nvPicPr>
+                    <pic:cNvPr id="998577790" name="Picture 1" descr="A black background with white text&#10;&#10;AI-generated content may be incorrect."/>
+                    <pic:cNvPicPr/>
+                  </pic:nvPicPr>
+                  <pic:blipFill>
+                    <a:blip r:embed="rId16"/>
+                    <a:stretch>
+                      <a:fillRect/>
+                    </a:stretch>
+                  </pic:blipFill>
+                  <pic:spPr>
+                    <a:xfrm>
+                      <a:off x="0" y="0"/>
+                      <a:ext cx="2829320" cy="638264"/>
+                    </a:xfrm>
+                    <a:prstGeom prst="rect">
+                      <a:avLst/>
+                    </a:prstGeom>
+                  </pic:spPr>
+                </pic:pic>
+              </a:graphicData>
+            </a:graphic>
+          </wp:inline>
+        </w:drawing>
+      </w:r>
+    </w:p>
+    <w:p>
+      <w:r>
+        <w:t>This way dbt libraries will be kept separate to other libraries used by Airflow what is beneficial as those libraries might be in conflict.</w:t>
+      </w:r>
+    </w:p>
+    <w:p>
+      <w:pPr>
+        <w:spacing w:after="0"/>
+      </w:pPr>
+    </w:p>
+    <w:p>
+      <w:pPr>
+        <w:pStyle w:val="Heading2"/>
+      </w:pPr>
+      <w:r>
+        <w:lastRenderedPageBreak/>
         <w:t>Rendering options for dbtTaskGroup</w:t>
       </w:r>
     </w:p>
@@ -827,14 +1211,30 @@
         <w:spacing w:after="0"/>
       </w:pPr>
       <w:r>
-        <w:t>For every task group created using the dbtTaskGroup we can define which dbt commands will be executed, for example we can only build models, or snapshots, or only perform tests. We configure that using the render_config argument and the RenderConfig() function in the following way:</w:t>
-      </w:r>
-    </w:p>
-    <w:p>
-      <w:pPr>
-        <w:spacing w:after="0"/>
-      </w:pPr>
-      <w:r>
+        <w:t xml:space="preserve">For every task group created using the dbtTaskGroup we can define which dbt commands will be executed, for example we can only build models, or snapshots, or only perform tests. </w:t>
+      </w:r>
+    </w:p>
+    <w:p>
+      <w:pPr>
+        <w:spacing w:after="0"/>
+      </w:pPr>
+    </w:p>
+    <w:p>
+      <w:pPr>
+        <w:spacing w:after="0"/>
+      </w:pPr>
+      <w:r>
+        <w:t>We configure that using the render_config argument and the RenderConfig() function in the following way:</w:t>
+      </w:r>
+    </w:p>
+    <w:p>
+      <w:pPr>
+        <w:spacing w:after="0"/>
+      </w:pPr>
+      <w:r>
+        <w:rPr>
+          <w:noProof/>
+        </w:rPr>
         <w:drawing>
           <wp:inline distT="0" distB="0" distL="0" distR="0" wp14:anchorId="336D7871" wp14:editId="18EE9704">
             <wp:extent cx="2457793" cy="924054"/>
@@ -851,7 +1251,7 @@
                     <pic:cNvPicPr/>
                   </pic:nvPicPr>
                   <pic:blipFill>
-                    <a:blip r:embed="rId9"/>
+                    <a:blip r:embed="rId17"/>
                     <a:stretch>
                       <a:fillRect/>
                     </a:stretch>
@@ -914,14 +1314,7 @@
           <w:b/>
           <w:bCs/>
         </w:rPr>
-        <w:t>exclude=["selector"]</w:t>
-      </w:r>
-      <w:r>
-        <w:rPr>
-          <w:b/>
-          <w:bCs/>
-        </w:rPr>
-        <w:t xml:space="preserve"> </w:t>
+        <w:t xml:space="preserve">exclude=["selector"] </w:t>
       </w:r>
       <w:r>
         <w:t>- We are using here node selectors like in the select=["selector"] but it excludes specific nodes.</w:t>
@@ -997,6 +1390,10 @@
         <w:spacing w:after="0"/>
       </w:pPr>
       <w:r>
+        <w:rPr>
+          <w:noProof/>
+        </w:rPr>
+        <w:lastRenderedPageBreak/>
         <w:drawing>
           <wp:inline distT="0" distB="0" distL="0" distR="0" wp14:anchorId="4E24EDF0" wp14:editId="2C95D6E8">
             <wp:extent cx="4544059" cy="1648055"/>
@@ -1013,7 +1410,7 @@
                     <pic:cNvPicPr/>
                   </pic:nvPicPr>
                   <pic:blipFill>
-                    <a:blip r:embed="rId10"/>
+                    <a:blip r:embed="rId18"/>
                     <a:stretch>
                       <a:fillRect/>
                     </a:stretch>
@@ -1099,6 +1496,115 @@
         <w:t>When we want to change metadata columns names for snapshots there is some problem and it doesn't work. I was trying both snapshots defined as a YAML file and SQL.</w:t>
       </w:r>
     </w:p>
+    <w:p>
+      <w:pPr>
+        <w:pStyle w:val="Heading2"/>
+      </w:pPr>
+      <w:r>
+        <w:t>Targets</w:t>
+      </w:r>
+    </w:p>
+    <w:p>
+      <w:r>
+        <w:t xml:space="preserve">In the </w:t>
+      </w:r>
+      <w:r>
+        <w:t>ProfileConfig</w:t>
+      </w:r>
+      <w:r>
+        <w:t xml:space="preserve"> we can specify the target in which we want to build our models:</w:t>
+      </w:r>
+      <w:r>
+        <w:br/>
+      </w:r>
+      <w:r>
+        <w:rPr>
+          <w:noProof/>
+        </w:rPr>
+        <w:drawing>
+          <wp:inline distT="0" distB="0" distL="0" distR="0" wp14:anchorId="68A827D2" wp14:editId="789387DF">
+            <wp:extent cx="4610743" cy="1028844"/>
+            <wp:effectExtent l="0" t="0" r="0" b="0"/>
+            <wp:docPr id="1647633861" name="Picture 1" descr="A computer screen with text&#10;&#10;AI-generated content may be incorrect."/>
+            <wp:cNvGraphicFramePr>
+              <a:graphicFrameLocks xmlns:a="http://schemas.openxmlformats.org/drawingml/2006/main" noChangeAspect="1"/>
+            </wp:cNvGraphicFramePr>
+            <a:graphic xmlns:a="http://schemas.openxmlformats.org/drawingml/2006/main">
+              <a:graphicData uri="http://schemas.openxmlformats.org/drawingml/2006/picture">
+                <pic:pic xmlns:pic="http://schemas.openxmlformats.org/drawingml/2006/picture">
+                  <pic:nvPicPr>
+                    <pic:cNvPr id="1647633861" name="Picture 1" descr="A computer screen with text&#10;&#10;AI-generated content may be incorrect."/>
+                    <pic:cNvPicPr/>
+                  </pic:nvPicPr>
+                  <pic:blipFill>
+                    <a:blip r:embed="rId19"/>
+                    <a:stretch>
+                      <a:fillRect/>
+                    </a:stretch>
+                  </pic:blipFill>
+                  <pic:spPr>
+                    <a:xfrm>
+                      <a:off x="0" y="0"/>
+                      <a:ext cx="4610743" cy="1028844"/>
+                    </a:xfrm>
+                    <a:prstGeom prst="rect">
+                      <a:avLst/>
+                    </a:prstGeom>
+                  </pic:spPr>
+                </pic:pic>
+              </a:graphicData>
+            </a:graphic>
+          </wp:inline>
+        </w:drawing>
+      </w:r>
+    </w:p>
+    <w:p>
+      <w:r>
+        <w:t>And then use that ProfileConfig in the dbtTaskGroup:</w:t>
+      </w:r>
+    </w:p>
+    <w:p>
+      <w:r>
+        <w:rPr>
+          <w:noProof/>
+        </w:rPr>
+        <w:drawing>
+          <wp:inline distT="0" distB="0" distL="0" distR="0" wp14:anchorId="139C13B1" wp14:editId="1874F854">
+            <wp:extent cx="3972479" cy="1124107"/>
+            <wp:effectExtent l="0" t="0" r="0" b="0"/>
+            <wp:docPr id="787805987" name="Picture 1" descr="A screen shot of a computer program&#10;&#10;AI-generated content may be incorrect."/>
+            <wp:cNvGraphicFramePr>
+              <a:graphicFrameLocks xmlns:a="http://schemas.openxmlformats.org/drawingml/2006/main" noChangeAspect="1"/>
+            </wp:cNvGraphicFramePr>
+            <a:graphic xmlns:a="http://schemas.openxmlformats.org/drawingml/2006/main">
+              <a:graphicData uri="http://schemas.openxmlformats.org/drawingml/2006/picture">
+                <pic:pic xmlns:pic="http://schemas.openxmlformats.org/drawingml/2006/picture">
+                  <pic:nvPicPr>
+                    <pic:cNvPr id="787805987" name="Picture 1" descr="A screen shot of a computer program&#10;&#10;AI-generated content may be incorrect."/>
+                    <pic:cNvPicPr/>
+                  </pic:nvPicPr>
+                  <pic:blipFill>
+                    <a:blip r:embed="rId20"/>
+                    <a:stretch>
+                      <a:fillRect/>
+                    </a:stretch>
+                  </pic:blipFill>
+                  <pic:spPr>
+                    <a:xfrm>
+                      <a:off x="0" y="0"/>
+                      <a:ext cx="3972479" cy="1124107"/>
+                    </a:xfrm>
+                    <a:prstGeom prst="rect">
+                      <a:avLst/>
+                    </a:prstGeom>
+                  </pic:spPr>
+                </pic:pic>
+              </a:graphicData>
+            </a:graphic>
+          </wp:inline>
+        </w:drawing>
+      </w:r>
+    </w:p>
     <w:p/>
     <w:sectPr>
       <w:pgSz w:w="12240" w:h="15840"/>
@@ -1113,6 +1619,119 @@
 <file path=word/numbering.xml><?xml version="1.0" encoding="utf-8"?>
 <w:numbering xmlns:wpc="http://schemas.microsoft.com/office/word/2010/wordprocessingCanvas" xmlns:cx="http://schemas.microsoft.com/office/drawing/2014/chartex" xmlns:cx1="http://schemas.microsoft.com/office/drawing/2015/9/8/chartex" xmlns:cx2="http://schemas.microsoft.com/office/drawing/2015/10/21/chartex" xmlns:cx3="http://schemas.microsoft.com/office/drawing/2016/5/9/chartex" xmlns:cx4="http://schemas.microsoft.com/office/drawing/2016/5/10/chartex" xmlns:cx5="http://schemas.microsoft.com/office/drawing/2016/5/11/chartex" xmlns:cx6="http://schemas.microsoft.com/office/drawing/2016/5/12/chartex" xmlns:cx7="http://schemas.microsoft.com/office/drawing/2016/5/13/chartex" xmlns:cx8="http://schemas.microsoft.com/office/drawing/2016/5/14/chartex" xmlns:mc="http://schemas.openxmlformats.org/markup-compatibility/2006" xmlns:aink="http://schemas.microsoft.com/office/drawing/2016/ink" xmlns:am3d="http://schemas.microsoft.com/office/drawing/2017/model3d" xmlns:o="urn:schemas-microsoft-com:office:office" xmlns:oel="http://schemas.microsoft.com/office/2019/extlst" xmlns:r="http://schemas.openxmlformats.org/officeDocument/2006/relationships" xmlns:m="http://schemas.openxmlformats.org/officeDocument/2006/math" xmlns:v="urn:schemas-microsoft-com:vml" xmlns:wp14="http://schemas.microsoft.com/office/word/2010/wordprocessingDrawing" xmlns:wp="http://schemas.openxmlformats.org/drawingml/2006/wordprocessingDrawing" xmlns:w10="urn:schemas-microsoft-com:office:word" xmlns:w="http://schemas.openxmlformats.org/wordprocessingml/2006/main" xmlns:w14="http://schemas.microsoft.com/office/word/2010/wordml" xmlns:w15="http://schemas.microsoft.com/office/word/2012/wordml" xmlns:w16cex="http://schemas.microsoft.com/office/word/2018/wordml/cex" xmlns:w16cid="http://schemas.microsoft.com/office/word/2016/wordml/cid" xmlns:w16="http://schemas.microsoft.com/office/word/2018/wordml" xmlns:w16du="http://schemas.microsoft.com/office/word/2023/wordml/word16du" xmlns:w16sdtdh="http://schemas.microsoft.com/office/word/2020/wordml/sdtdatahash" xmlns:w16sdtfl="http://schemas.microsoft.com/office/word/2024/wordml/sdtformatlock" xmlns:w16se="http://schemas.microsoft.com/office/word/2015/wordml/symex" xmlns:wpg="http://schemas.microsoft.com/office/word/2010/wordprocessingGroup" xmlns:wpi="http://schemas.microsoft.com/office/word/2010/wordprocessingInk" xmlns:wne="http://schemas.microsoft.com/office/word/2006/wordml" xmlns:wps="http://schemas.microsoft.com/office/word/2010/wordprocessingShape" mc:Ignorable="w14 w15 w16se w16cid w16 w16cex w16sdtdh w16sdtfl w16du wp14">
   <w:abstractNum w:abstractNumId="0" w15:restartNumberingAfterBreak="0">
+    <w:nsid w:val="0F1977CB"/>
+    <w:multiLevelType w:val="hybridMultilevel"/>
+    <w:tmpl w:val="0C00B494"/>
+    <w:lvl w:ilvl="0" w:tplc="04090001">
+      <w:start w:val="1"/>
+      <w:numFmt w:val="bullet"/>
+      <w:lvlText w:val=""/>
+      <w:lvlJc w:val="left"/>
+      <w:pPr>
+        <w:ind w:left="720" w:hanging="360"/>
+      </w:pPr>
+      <w:rPr>
+        <w:rFonts w:ascii="Symbol" w:hAnsi="Symbol" w:hint="default"/>
+      </w:rPr>
+    </w:lvl>
+    <w:lvl w:ilvl="1" w:tplc="04090003" w:tentative="1">
+      <w:start w:val="1"/>
+      <w:numFmt w:val="bullet"/>
+      <w:lvlText w:val="o"/>
+      <w:lvlJc w:val="left"/>
+      <w:pPr>
+        <w:ind w:left="1440" w:hanging="360"/>
+      </w:pPr>
+      <w:rPr>
+        <w:rFonts w:ascii="Courier New" w:hAnsi="Courier New" w:cs="Courier New" w:hint="default"/>
+      </w:rPr>
+    </w:lvl>
+    <w:lvl w:ilvl="2" w:tplc="04090005" w:tentative="1">
+      <w:start w:val="1"/>
+      <w:numFmt w:val="bullet"/>
+      <w:lvlText w:val=""/>
+      <w:lvlJc w:val="left"/>
+      <w:pPr>
+        <w:ind w:left="2160" w:hanging="360"/>
+      </w:pPr>
+      <w:rPr>
+        <w:rFonts w:ascii="Wingdings" w:hAnsi="Wingdings" w:hint="default"/>
+      </w:rPr>
+    </w:lvl>
+    <w:lvl w:ilvl="3" w:tplc="04090001" w:tentative="1">
+      <w:start w:val="1"/>
+      <w:numFmt w:val="bullet"/>
+      <w:lvlText w:val=""/>
+      <w:lvlJc w:val="left"/>
+      <w:pPr>
+        <w:ind w:left="2880" w:hanging="360"/>
+      </w:pPr>
+      <w:rPr>
+        <w:rFonts w:ascii="Symbol" w:hAnsi="Symbol" w:hint="default"/>
+      </w:rPr>
+    </w:lvl>
+    <w:lvl w:ilvl="4" w:tplc="04090003" w:tentative="1">
+      <w:start w:val="1"/>
+      <w:numFmt w:val="bullet"/>
+      <w:lvlText w:val="o"/>
+      <w:lvlJc w:val="left"/>
+      <w:pPr>
+        <w:ind w:left="3600" w:hanging="360"/>
+      </w:pPr>
+      <w:rPr>
+        <w:rFonts w:ascii="Courier New" w:hAnsi="Courier New" w:cs="Courier New" w:hint="default"/>
+      </w:rPr>
+    </w:lvl>
+    <w:lvl w:ilvl="5" w:tplc="04090005" w:tentative="1">
+      <w:start w:val="1"/>
+      <w:numFmt w:val="bullet"/>
+      <w:lvlText w:val=""/>
+      <w:lvlJc w:val="left"/>
+      <w:pPr>
+        <w:ind w:left="4320" w:hanging="360"/>
+      </w:pPr>
+      <w:rPr>
+        <w:rFonts w:ascii="Wingdings" w:hAnsi="Wingdings" w:hint="default"/>
+      </w:rPr>
+    </w:lvl>
+    <w:lvl w:ilvl="6" w:tplc="04090001" w:tentative="1">
+      <w:start w:val="1"/>
+      <w:numFmt w:val="bullet"/>
+      <w:lvlText w:val=""/>
+      <w:lvlJc w:val="left"/>
+      <w:pPr>
+        <w:ind w:left="5040" w:hanging="360"/>
+      </w:pPr>
+      <w:rPr>
+        <w:rFonts w:ascii="Symbol" w:hAnsi="Symbol" w:hint="default"/>
+      </w:rPr>
+    </w:lvl>
+    <w:lvl w:ilvl="7" w:tplc="04090003" w:tentative="1">
+      <w:start w:val="1"/>
+      <w:numFmt w:val="bullet"/>
+      <w:lvlText w:val="o"/>
+      <w:lvlJc w:val="left"/>
+      <w:pPr>
+        <w:ind w:left="5760" w:hanging="360"/>
+      </w:pPr>
+      <w:rPr>
+        <w:rFonts w:ascii="Courier New" w:hAnsi="Courier New" w:cs="Courier New" w:hint="default"/>
+      </w:rPr>
+    </w:lvl>
+    <w:lvl w:ilvl="8" w:tplc="04090005" w:tentative="1">
+      <w:start w:val="1"/>
+      <w:numFmt w:val="bullet"/>
+      <w:lvlText w:val=""/>
+      <w:lvlJc w:val="left"/>
+      <w:pPr>
+        <w:ind w:left="6480" w:hanging="360"/>
+      </w:pPr>
+      <w:rPr>
+        <w:rFonts w:ascii="Wingdings" w:hAnsi="Wingdings" w:hint="default"/>
+      </w:rPr>
+    </w:lvl>
+  </w:abstractNum>
+  <w:abstractNum w:abstractNumId="1" w15:restartNumberingAfterBreak="0">
     <w:nsid w:val="1E304873"/>
     <w:multiLevelType w:val="hybridMultilevel"/>
     <w:tmpl w:val="43E2B6F2"/>
@@ -1225,7 +1844,7 @@
       </w:rPr>
     </w:lvl>
   </w:abstractNum>
-  <w:abstractNum w:abstractNumId="1" w15:restartNumberingAfterBreak="0">
+  <w:abstractNum w:abstractNumId="2" w15:restartNumberingAfterBreak="0">
     <w:nsid w:val="21EA346C"/>
     <w:multiLevelType w:val="hybridMultilevel"/>
     <w:tmpl w:val="12D6DD12"/>
@@ -1337,7 +1956,7 @@
       </w:rPr>
     </w:lvl>
   </w:abstractNum>
-  <w:abstractNum w:abstractNumId="2" w15:restartNumberingAfterBreak="0">
+  <w:abstractNum w:abstractNumId="3" w15:restartNumberingAfterBreak="0">
     <w:nsid w:val="2BF636F3"/>
     <w:multiLevelType w:val="hybridMultilevel"/>
     <w:tmpl w:val="614C1B76"/>
@@ -1450,7 +2069,7 @@
       </w:rPr>
     </w:lvl>
   </w:abstractNum>
-  <w:abstractNum w:abstractNumId="3" w15:restartNumberingAfterBreak="0">
+  <w:abstractNum w:abstractNumId="4" w15:restartNumberingAfterBreak="0">
     <w:nsid w:val="3928699E"/>
     <w:multiLevelType w:val="hybridMultilevel"/>
     <w:tmpl w:val="5B6A6658"/>
@@ -1563,7 +2182,7 @@
       </w:rPr>
     </w:lvl>
   </w:abstractNum>
-  <w:abstractNum w:abstractNumId="4" w15:restartNumberingAfterBreak="0">
+  <w:abstractNum w:abstractNumId="5" w15:restartNumberingAfterBreak="0">
     <w:nsid w:val="49755240"/>
     <w:multiLevelType w:val="hybridMultilevel"/>
     <w:tmpl w:val="AC34EF34"/>
@@ -1675,7 +2294,7 @@
       </w:rPr>
     </w:lvl>
   </w:abstractNum>
-  <w:abstractNum w:abstractNumId="5" w15:restartNumberingAfterBreak="0">
+  <w:abstractNum w:abstractNumId="6" w15:restartNumberingAfterBreak="0">
     <w:nsid w:val="5A7F7CD8"/>
     <w:multiLevelType w:val="hybridMultilevel"/>
     <w:tmpl w:val="1E90E668"/>
@@ -1691,7 +2310,7 @@
         <w:rFonts w:ascii="Symbol" w:hAnsi="Symbol" w:hint="default"/>
       </w:rPr>
     </w:lvl>
-    <w:lvl w:ilvl="1" w:tplc="FFFFFFFF" w:tentative="1">
+    <w:lvl w:ilvl="1" w:tplc="FFFFFFFF">
       <w:start w:val="1"/>
       <w:numFmt w:val="bullet"/>
       <w:lvlText w:val="o"/>
@@ -1788,7 +2407,7 @@
       </w:rPr>
     </w:lvl>
   </w:abstractNum>
-  <w:abstractNum w:abstractNumId="6" w15:restartNumberingAfterBreak="0">
+  <w:abstractNum w:abstractNumId="7" w15:restartNumberingAfterBreak="0">
     <w:nsid w:val="5C073D25"/>
     <w:multiLevelType w:val="hybridMultilevel"/>
     <w:tmpl w:val="0074E3BE"/>
@@ -1901,7 +2520,7 @@
       </w:rPr>
     </w:lvl>
   </w:abstractNum>
-  <w:abstractNum w:abstractNumId="7" w15:restartNumberingAfterBreak="0">
+  <w:abstractNum w:abstractNumId="8" w15:restartNumberingAfterBreak="0">
     <w:nsid w:val="682F2E34"/>
     <w:multiLevelType w:val="hybridMultilevel"/>
     <w:tmpl w:val="DDA0E2E2"/>
@@ -2013,7 +2632,7 @@
       </w:rPr>
     </w:lvl>
   </w:abstractNum>
-  <w:abstractNum w:abstractNumId="8" w15:restartNumberingAfterBreak="0">
+  <w:abstractNum w:abstractNumId="9" w15:restartNumberingAfterBreak="0">
     <w:nsid w:val="6C3509E0"/>
     <w:multiLevelType w:val="hybridMultilevel"/>
     <w:tmpl w:val="E6B06F1E"/>
@@ -2126,7 +2745,7 @@
       </w:rPr>
     </w:lvl>
   </w:abstractNum>
-  <w:abstractNum w:abstractNumId="9" w15:restartNumberingAfterBreak="0">
+  <w:abstractNum w:abstractNumId="10" w15:restartNumberingAfterBreak="0">
     <w:nsid w:val="7DAF7D02"/>
     <w:multiLevelType w:val="hybridMultilevel"/>
     <w:tmpl w:val="192AD382"/>
@@ -2239,7 +2858,7 @@
       </w:rPr>
     </w:lvl>
   </w:abstractNum>
-  <w:abstractNum w:abstractNumId="10" w15:restartNumberingAfterBreak="0">
+  <w:abstractNum w:abstractNumId="11" w15:restartNumberingAfterBreak="0">
     <w:nsid w:val="7EF97CE8"/>
     <w:multiLevelType w:val="hybridMultilevel"/>
     <w:tmpl w:val="906C0BDE"/>
@@ -2353,37 +2972,40 @@
     </w:lvl>
   </w:abstractNum>
   <w:num w:numId="1" w16cid:durableId="1699618029">
+    <w:abstractNumId w:val="9"/>
+  </w:num>
+  <w:num w:numId="2" w16cid:durableId="1984845899">
+    <w:abstractNumId w:val="2"/>
+  </w:num>
+  <w:num w:numId="3" w16cid:durableId="1711757087">
+    <w:abstractNumId w:val="7"/>
+  </w:num>
+  <w:num w:numId="4" w16cid:durableId="401290549">
+    <w:abstractNumId w:val="10"/>
+  </w:num>
+  <w:num w:numId="5" w16cid:durableId="459107247">
     <w:abstractNumId w:val="8"/>
   </w:num>
-  <w:num w:numId="2" w16cid:durableId="1984845899">
+  <w:num w:numId="6" w16cid:durableId="758452565">
+    <w:abstractNumId w:val="6"/>
+  </w:num>
+  <w:num w:numId="7" w16cid:durableId="1636334537">
     <w:abstractNumId w:val="1"/>
   </w:num>
-  <w:num w:numId="3" w16cid:durableId="1711757087">
-    <w:abstractNumId w:val="6"/>
-  </w:num>
-  <w:num w:numId="4" w16cid:durableId="401290549">
-    <w:abstractNumId w:val="9"/>
-  </w:num>
-  <w:num w:numId="5" w16cid:durableId="459107247">
-    <w:abstractNumId w:val="7"/>
-  </w:num>
-  <w:num w:numId="6" w16cid:durableId="758452565">
+  <w:num w:numId="8" w16cid:durableId="1219970554">
     <w:abstractNumId w:val="5"/>
   </w:num>
-  <w:num w:numId="7" w16cid:durableId="1636334537">
-    <w:abstractNumId w:val="0"/>
-  </w:num>
-  <w:num w:numId="8" w16cid:durableId="1219970554">
+  <w:num w:numId="9" w16cid:durableId="726105640">
     <w:abstractNumId w:val="4"/>
   </w:num>
-  <w:num w:numId="9" w16cid:durableId="726105640">
+  <w:num w:numId="10" w16cid:durableId="739594580">
+    <w:abstractNumId w:val="11"/>
+  </w:num>
+  <w:num w:numId="11" w16cid:durableId="934291788">
     <w:abstractNumId w:val="3"/>
   </w:num>
-  <w:num w:numId="10" w16cid:durableId="739594580">
-    <w:abstractNumId w:val="10"/>
-  </w:num>
-  <w:num w:numId="11" w16cid:durableId="934291788">
-    <w:abstractNumId w:val="2"/>
+  <w:num w:numId="12" w16cid:durableId="198008988">
+    <w:abstractNumId w:val="0"/>
   </w:num>
 </w:numbering>
 </file>
@@ -2989,6 +3611,7 @@
   <w:style w:type="character" w:default="1" w:styleId="DefaultParagraphFont">
     <w:name w:val="Default Paragraph Font"/>
     <w:uiPriority w:val="1"/>
+    <w:semiHidden/>
     <w:unhideWhenUsed/>
   </w:style>
   <w:style w:type="table" w:default="1" w:styleId="TableNormal">
@@ -3323,6 +3946,18 @@
       <w:shd w:val="clear" w:color="auto" w:fill="E1DFDD"/>
     </w:rPr>
   </w:style>
+  <w:style w:type="character" w:styleId="FollowedHyperlink">
+    <w:name w:val="FollowedHyperlink"/>
+    <w:basedOn w:val="DefaultParagraphFont"/>
+    <w:uiPriority w:val="99"/>
+    <w:semiHidden/>
+    <w:unhideWhenUsed/>
+    <w:rsid w:val="00DA73CC"/>
+    <w:rPr>
+      <w:color w:val="96607D" w:themeColor="followedHyperlink"/>
+      <w:u w:val="single"/>
+    </w:rPr>
+  </w:style>
 </w:styles>
 </file>
 

</xml_diff>

<commit_message>
modified notes about hadoop and spark
</commit_message>
<xml_diff>
--- a/dbt/dbt notes.docx
+++ b/dbt/dbt notes.docx
@@ -657,7 +657,50 @@
     </w:p>
     <w:p>
       <w:r>
-        <w:t>In the profiles.yml file we can specify different targets, that is different databases where we will be building models.</w:t>
+        <w:t>In the profiles.yml file we can specify different targets, that is different databases where we will be building models</w:t>
+      </w:r>
+      <w:r>
+        <w:t>. For example here we are specifying two targets called ‘dev’ and ‘prod’:</w:t>
+      </w:r>
+    </w:p>
+    <w:p>
+      <w:r>
+        <w:lastRenderedPageBreak/>
+        <w:drawing>
+          <wp:inline distT="0" distB="0" distL="0" distR="0" wp14:anchorId="09E35DB1" wp14:editId="21B96A4E">
+            <wp:extent cx="2478167" cy="3530278"/>
+            <wp:effectExtent l="0" t="0" r="0" b="0"/>
+            <wp:docPr id="22266288" name="Picture 1" descr="A screenshot of a computer screen&#10;&#10;AI-generated content may be incorrect."/>
+            <wp:cNvGraphicFramePr>
+              <a:graphicFrameLocks xmlns:a="http://schemas.openxmlformats.org/drawingml/2006/main" noChangeAspect="1"/>
+            </wp:cNvGraphicFramePr>
+            <a:graphic xmlns:a="http://schemas.openxmlformats.org/drawingml/2006/main">
+              <a:graphicData uri="http://schemas.openxmlformats.org/drawingml/2006/picture">
+                <pic:pic xmlns:pic="http://schemas.openxmlformats.org/drawingml/2006/picture">
+                  <pic:nvPicPr>
+                    <pic:cNvPr id="22266288" name="Picture 1" descr="A screenshot of a computer screen&#10;&#10;AI-generated content may be incorrect."/>
+                    <pic:cNvPicPr/>
+                  </pic:nvPicPr>
+                  <pic:blipFill>
+                    <a:blip r:embed="rId8"/>
+                    <a:stretch>
+                      <a:fillRect/>
+                    </a:stretch>
+                  </pic:blipFill>
+                  <pic:spPr>
+                    <a:xfrm>
+                      <a:off x="0" y="0"/>
+                      <a:ext cx="2484523" cy="3539332"/>
+                    </a:xfrm>
+                    <a:prstGeom prst="rect">
+                      <a:avLst/>
+                    </a:prstGeom>
+                  </pic:spPr>
+                </pic:pic>
+              </a:graphicData>
+            </a:graphic>
+          </wp:inline>
+        </w:drawing>
       </w:r>
     </w:p>
     <w:p>
@@ -670,7 +713,6 @@
         <w:rPr>
           <w:noProof/>
         </w:rPr>
-        <w:lastRenderedPageBreak/>
         <w:drawing>
           <wp:inline distT="0" distB="0" distL="0" distR="0" wp14:anchorId="59B9BC13" wp14:editId="1BAA2808">
             <wp:extent cx="2448267" cy="885949"/>
@@ -687,7 +729,7 @@
                     <pic:cNvPicPr/>
                   </pic:nvPicPr>
                   <pic:blipFill>
-                    <a:blip r:embed="rId8"/>
+                    <a:blip r:embed="rId9"/>
                     <a:stretch>
                       <a:fillRect/>
                     </a:stretch>
@@ -733,7 +775,7 @@
       <w:r>
         <w:t xml:space="preserve">. More info about that: </w:t>
       </w:r>
-      <w:hyperlink r:id="rId9" w:history="1">
+      <w:hyperlink r:id="rId10" w:history="1">
         <w:r>
           <w:rPr>
             <w:rStyle w:val="Hyperlink"/>
@@ -840,6 +882,7 @@
         <w:spacing w:before="0" w:after="0"/>
       </w:pPr>
       <w:r>
+        <w:lastRenderedPageBreak/>
         <w:t>cosmos functionalities</w:t>
       </w:r>
     </w:p>
@@ -863,7 +906,7 @@
         </w:numPr>
         <w:spacing w:after="0"/>
       </w:pPr>
-      <w:hyperlink r:id="rId10" w:history="1">
+      <w:hyperlink r:id="rId11" w:history="1">
         <w:r>
           <w:rPr>
             <w:rStyle w:val="Hyperlink"/>
@@ -881,7 +924,7 @@
         </w:numPr>
         <w:spacing w:after="0"/>
       </w:pPr>
-      <w:hyperlink r:id="rId11" w:history="1">
+      <w:hyperlink r:id="rId12" w:history="1">
         <w:r>
           <w:rPr>
             <w:rStyle w:val="Hyperlink"/>
@@ -956,7 +999,7 @@
                     <pic:cNvPicPr/>
                   </pic:nvPicPr>
                   <pic:blipFill>
-                    <a:blip r:embed="rId12"/>
+                    <a:blip r:embed="rId13"/>
                     <a:stretch>
                       <a:fillRect/>
                     </a:stretch>
@@ -990,7 +1033,6 @@
         <w:spacing w:after="0"/>
       </w:pPr>
       <w:r>
-        <w:lastRenderedPageBreak/>
         <w:drawing>
           <wp:inline distT="0" distB="0" distL="0" distR="0" wp14:anchorId="4C581211" wp14:editId="1B201350">
             <wp:extent cx="2514951" cy="600159"/>
@@ -1007,7 +1049,7 @@
                     <pic:cNvPicPr/>
                   </pic:nvPicPr>
                   <pic:blipFill>
-                    <a:blip r:embed="rId13"/>
+                    <a:blip r:embed="rId14"/>
                     <a:stretch>
                       <a:fillRect/>
                     </a:stretch>
@@ -1064,7 +1106,7 @@
                     <pic:cNvPicPr/>
                   </pic:nvPicPr>
                   <pic:blipFill>
-                    <a:blip r:embed="rId14"/>
+                    <a:blip r:embed="rId15"/>
                     <a:stretch>
                       <a:fillRect/>
                     </a:stretch>
@@ -1101,6 +1143,7 @@
     </w:p>
     <w:p>
       <w:r>
+        <w:lastRenderedPageBreak/>
         <w:t>It is a good practice to create a virtual environment for dbt, install there all the dbt libraries needed (dbt-core, dbt-databricks) and provide the following executable path:</w:t>
       </w:r>
     </w:p>
@@ -1122,7 +1165,7 @@
                     <pic:cNvPicPr/>
                   </pic:nvPicPr>
                   <pic:blipFill>
-                    <a:blip r:embed="rId15"/>
+                    <a:blip r:embed="rId16"/>
                     <a:stretch>
                       <a:fillRect/>
                     </a:stretch>
@@ -1166,7 +1209,7 @@
                     <pic:cNvPicPr/>
                   </pic:nvPicPr>
                   <pic:blipFill>
-                    <a:blip r:embed="rId16"/>
+                    <a:blip r:embed="rId17"/>
                     <a:stretch>
                       <a:fillRect/>
                     </a:stretch>
@@ -1202,7 +1245,6 @@
         <w:pStyle w:val="Heading2"/>
       </w:pPr>
       <w:r>
-        <w:lastRenderedPageBreak/>
         <w:t>Rendering options for dbtTaskGroup</w:t>
       </w:r>
     </w:p>
@@ -1251,7 +1293,7 @@
                     <pic:cNvPicPr/>
                   </pic:nvPicPr>
                   <pic:blipFill>
-                    <a:blip r:embed="rId17"/>
+                    <a:blip r:embed="rId18"/>
                     <a:stretch>
                       <a:fillRect/>
                     </a:stretch>
@@ -1337,7 +1379,11 @@
         <w:t>should_detach_multiple_parents_tests=True</w:t>
       </w:r>
       <w:r>
-        <w:t xml:space="preserve"> - This argument makes sure that when we have models dependent on each other then we will not execute the same tests twice and when tests depends on a multiple models, then they will be performed when all those models have been built. Otherwise we might perform test which includes a model which has not been built yet and it will fail.</w:t>
+        <w:t xml:space="preserve"> - This argument makes sure that when we have models dependent on each other then we will not execute the same tests twice and when tests depends on a multiple models, then they will be performed when </w:t>
+      </w:r>
+      <w:r>
+        <w:lastRenderedPageBreak/>
+        <w:t>all those models have been built. Otherwise we might perform test which includes a model which has not been built yet and it will fail.</w:t>
       </w:r>
     </w:p>
     <w:p>
@@ -1393,7 +1439,6 @@
         <w:rPr>
           <w:noProof/>
         </w:rPr>
-        <w:lastRenderedPageBreak/>
         <w:drawing>
           <wp:inline distT="0" distB="0" distL="0" distR="0" wp14:anchorId="4E24EDF0" wp14:editId="2C95D6E8">
             <wp:extent cx="4544059" cy="1648055"/>
@@ -1410,7 +1455,7 @@
                     <pic:cNvPicPr/>
                   </pic:nvPicPr>
                   <pic:blipFill>
-                    <a:blip r:embed="rId18"/>
+                    <a:blip r:embed="rId19"/>
                     <a:stretch>
                       <a:fillRect/>
                     </a:stretch>
@@ -1494,115 +1539,6 @@
       </w:pPr>
       <w:r>
         <w:t>When we want to change metadata columns names for snapshots there is some problem and it doesn't work. I was trying both snapshots defined as a YAML file and SQL.</w:t>
-      </w:r>
-    </w:p>
-    <w:p>
-      <w:pPr>
-        <w:pStyle w:val="Heading2"/>
-      </w:pPr>
-      <w:r>
-        <w:t>Targets</w:t>
-      </w:r>
-    </w:p>
-    <w:p>
-      <w:r>
-        <w:t xml:space="preserve">In the </w:t>
-      </w:r>
-      <w:r>
-        <w:t>ProfileConfig</w:t>
-      </w:r>
-      <w:r>
-        <w:t xml:space="preserve"> we can specify the target in which we want to build our models:</w:t>
-      </w:r>
-      <w:r>
-        <w:br/>
-      </w:r>
-      <w:r>
-        <w:rPr>
-          <w:noProof/>
-        </w:rPr>
-        <w:drawing>
-          <wp:inline distT="0" distB="0" distL="0" distR="0" wp14:anchorId="68A827D2" wp14:editId="789387DF">
-            <wp:extent cx="4610743" cy="1028844"/>
-            <wp:effectExtent l="0" t="0" r="0" b="0"/>
-            <wp:docPr id="1647633861" name="Picture 1" descr="A computer screen with text&#10;&#10;AI-generated content may be incorrect."/>
-            <wp:cNvGraphicFramePr>
-              <a:graphicFrameLocks xmlns:a="http://schemas.openxmlformats.org/drawingml/2006/main" noChangeAspect="1"/>
-            </wp:cNvGraphicFramePr>
-            <a:graphic xmlns:a="http://schemas.openxmlformats.org/drawingml/2006/main">
-              <a:graphicData uri="http://schemas.openxmlformats.org/drawingml/2006/picture">
-                <pic:pic xmlns:pic="http://schemas.openxmlformats.org/drawingml/2006/picture">
-                  <pic:nvPicPr>
-                    <pic:cNvPr id="1647633861" name="Picture 1" descr="A computer screen with text&#10;&#10;AI-generated content may be incorrect."/>
-                    <pic:cNvPicPr/>
-                  </pic:nvPicPr>
-                  <pic:blipFill>
-                    <a:blip r:embed="rId19"/>
-                    <a:stretch>
-                      <a:fillRect/>
-                    </a:stretch>
-                  </pic:blipFill>
-                  <pic:spPr>
-                    <a:xfrm>
-                      <a:off x="0" y="0"/>
-                      <a:ext cx="4610743" cy="1028844"/>
-                    </a:xfrm>
-                    <a:prstGeom prst="rect">
-                      <a:avLst/>
-                    </a:prstGeom>
-                  </pic:spPr>
-                </pic:pic>
-              </a:graphicData>
-            </a:graphic>
-          </wp:inline>
-        </w:drawing>
-      </w:r>
-    </w:p>
-    <w:p>
-      <w:r>
-        <w:t>And then use that ProfileConfig in the dbtTaskGroup:</w:t>
-      </w:r>
-    </w:p>
-    <w:p>
-      <w:r>
-        <w:rPr>
-          <w:noProof/>
-        </w:rPr>
-        <w:drawing>
-          <wp:inline distT="0" distB="0" distL="0" distR="0" wp14:anchorId="139C13B1" wp14:editId="1874F854">
-            <wp:extent cx="3972479" cy="1124107"/>
-            <wp:effectExtent l="0" t="0" r="0" b="0"/>
-            <wp:docPr id="787805987" name="Picture 1" descr="A screen shot of a computer program&#10;&#10;AI-generated content may be incorrect."/>
-            <wp:cNvGraphicFramePr>
-              <a:graphicFrameLocks xmlns:a="http://schemas.openxmlformats.org/drawingml/2006/main" noChangeAspect="1"/>
-            </wp:cNvGraphicFramePr>
-            <a:graphic xmlns:a="http://schemas.openxmlformats.org/drawingml/2006/main">
-              <a:graphicData uri="http://schemas.openxmlformats.org/drawingml/2006/picture">
-                <pic:pic xmlns:pic="http://schemas.openxmlformats.org/drawingml/2006/picture">
-                  <pic:nvPicPr>
-                    <pic:cNvPr id="787805987" name="Picture 1" descr="A screen shot of a computer program&#10;&#10;AI-generated content may be incorrect."/>
-                    <pic:cNvPicPr/>
-                  </pic:nvPicPr>
-                  <pic:blipFill>
-                    <a:blip r:embed="rId20"/>
-                    <a:stretch>
-                      <a:fillRect/>
-                    </a:stretch>
-                  </pic:blipFill>
-                  <pic:spPr>
-                    <a:xfrm>
-                      <a:off x="0" y="0"/>
-                      <a:ext cx="3972479" cy="1124107"/>
-                    </a:xfrm>
-                    <a:prstGeom prst="rect">
-                      <a:avLst/>
-                    </a:prstGeom>
-                  </pic:spPr>
-                </pic:pic>
-              </a:graphicData>
-            </a:graphic>
-          </wp:inline>
-        </w:drawing>
       </w:r>
     </w:p>
     <w:p/>

</xml_diff>